<commit_message>
Fix currency mapping, SVG rendering, and dashboard improvements
- Fix currency-to-country mapping in make_transactions (NGN for NG, KSh for KE, etc.)
- Replace hardcoded $ with currency_fmt() across all dashboard pages
- Fix SVG architecture diagram rendering (use st.components.v1.html)
- Fix progress_ring chart SVG rendering
- Add missing import streamlit as st in overview.py
- Fix Zap icon case mismatch (Zap -> ZAP)
- Increase Kafka healthcheck timeout/retries in docker-compose
- Update Dockerfiles with --timeout 120
- Add dice-ml to requirements.txt
- Fix orchestrator supervised_models -> champion_models
- Add Phase 2 NetPFN training/inference cells to notebook
- Update study guide, beginner guide, and technical docs
</commit_message>
<xml_diff>
--- a/FraudTrap_Complete_Study_Guide.docx
+++ b/FraudTrap_Complete_Study_Guide.docx
@@ -3636,7 +3636,7 @@
         <w:ind w:left="0"/>
       </w:pPr>
       <w:r>
-        <w:t>VAE (Variational Autoencoder) — Reconstruction error anomaly score (weight: 0.40)</w:t>
+        <w:t>VAE (Variational Autoencoder) — Reconstruction error anomaly score (weight: 0.55)</w:t>
       </w:r>
     </w:p>
     <w:p>
@@ -3645,7 +3645,7 @@
         <w:ind w:left="0"/>
       </w:pPr>
       <w:r>
-        <w:t>Isolation Forest — Path length anomaly score (weight: 0.35)</w:t>
+        <w:t>Isolation Forest — Path length anomaly score (weight: 0.30)</w:t>
       </w:r>
     </w:p>
     <w:p>
@@ -3654,7 +3654,7 @@
         <w:ind w:left="0"/>
       </w:pPr>
       <w:r>
-        <w:t>Empirical Tail Detector — Robust z-score per feature (weight: 0.25)</w:t>
+        <w:t>Empirical Tail Detector — Robust z-score per feature (weight: 0.15)</w:t>
       </w:r>
     </w:p>
     <w:p>
@@ -3717,7 +3717,7 @@
         <w:ind w:left="0"/>
       </w:pPr>
       <w:r>
-        <w:t>Pseudo-labels generated from Phase 1 scores (high confidence only)</w:t>
+        <w:t>NetPFN (Neural Prototypical Few-shot Network) replaces XGBoost bridge</w:t>
       </w:r>
     </w:p>
     <w:p>
@@ -3789,7 +3789,7 @@
     </w:p>
     <w:p>
       <w:r>
-        <w:t>Full supervised ensemble with champion-challenger architecture:</w:t>
+        <w:t>Confidence-aware routing with CatBoost champion and FT-Transformer specialist:</w:t>
       </w:r>
     </w:p>
     <w:p>
@@ -4720,7 +4720,7 @@
     </w:p>
     <w:p>
       <w:r>
-        <w:t>Implemented in models/supervised/semi_supervised.py. The SemiSupervisedBridge uses pseudo-labeling to bootstrap a supervised model from unsupervised scores:</w:t>
+        <w:t>Implemented in models/supervised/semi_supervised.py. The NetPFN (Neural Prototypical Few-shot Network) uses prototype-based few-shot learning with pseudo-labelsised model from unsupervised scores:</w:t>
       </w:r>
     </w:p>
     <w:p>
@@ -4729,7 +4729,7 @@
         <w:ind w:left="0"/>
       </w:pPr>
       <w:r>
-        <w:t>Pseudo-labels: High-confidence predictions from Phase 1 (score &gt; 0.9 or &lt; 0.1)</w:t>
+        <w:t>Pseudo-labels: Confidence-weighted labels from Cold Start (threshold: 0.8)</w:t>
       </w:r>
     </w:p>
     <w:p>
@@ -4738,7 +4738,7 @@
         <w:ind w:left="0"/>
       </w:pPr>
       <w:r>
-        <w:t>XGBoost training: Confirmed labels (weight=3) + pseudo-labels (weight=1)</w:t>
+        <w:t>Prototype learning: Fraud/legitimate prototypes in embedding space</w:t>
       </w:r>
     </w:p>
     <w:p>
@@ -4756,7 +4756,7 @@
         <w:ind w:left="0"/>
       </w:pPr>
       <w:r>
-        <w:t>Blended scoring: w_cold * cold_score + w_xgb * xgb_proba</w:t>
+        <w:t>Distance-based classification: New transactions classified by prototype proximity</w:t>
       </w:r>
     </w:p>
     <w:p>
@@ -4777,7 +4777,7 @@
     </w:p>
     <w:p>
       <w:r>
-        <w:t>Implemented in models/supervised/champion.py. The ChampionModel is a single CatBoost classifier optimized for production inference:</w:t>
+        <w:t>Implemented in models/supervised/champion.py. The ChampionModel is a CatBoost classifier with confidence-aware routing to FT-Transformer specialist inference:</w:t>
       </w:r>
     </w:p>
     <w:p>
@@ -5028,7 +5028,7 @@
         <w:ind w:left="0"/>
       </w:pPr>
       <w:r>
-        <w:t>Temperature Scaling — Single parameter rescaling (used in ensemble: 0.7 isotonic + 0.3 temperature)</w:t>
+        <w:t>Temperature Scaling — Single parameter rescaling (available as alternative calibration method)</w:t>
       </w:r>
     </w:p>
     <w:p>
@@ -5704,7 +5704,7 @@
     </w:p>
     <w:p>
       <w:r>
-        <w:t>The Streamlit dashboard in dashboard/ provides seven main pages for monitoring and managing the fraud detection platform.</w:t>
+        <w:t>The Streamlit dashboard in dashboard/ provides nine main pages for monitoring and managing the fraud detection platform.</w:t>
       </w:r>
     </w:p>
     <w:p>
@@ -10611,7 +10611,7 @@
           <w:color w:val="333333"/>
           <w:sz w:val="18"/>
         </w:rPr>
-        <w:t xml:space="preserve">  algorithms: [xgboost, lightgbm, ft_transformer, tabnet]</w:t>
+        <w:t xml:space="preserve">  algorithms: [lightgbm, xgboost]  # offline benchmarks only</w:t>
       </w:r>
     </w:p>
     <w:p>

</xml_diff>

<commit_message>
feat: redesign Layer 2 as Adaptive Learning Layer with AdaptiveLearner abstraction
- Add models/adaptive_learning/ package: AdaptiveLearner ABC, TabPFNAdaptiveLearner, AdaptivePrediction, AdaptiveTrainer, AdaptiveMonitor
- Rename SEMI_SUPERVISED -> ADAPTIVE_LEARNING across codebase with backwards-compat aliases
- Add predict_with_uncertainty() to TabPFNAdaptiveLearner
- Remove hardcoded TABPFN_TOKEN from docker-compose.yml, load from .env via settings
- Add tabpfn_cache volume to persist HuggingFace model weights across container recreations
- Update PhaseState.from_json() with backwards-compat mapping for old SEMI_SUPERVISED values
- Update all docs: README, Technical Documentation, Study Guide, Beginner Guide, API docs
- Add TabPFN licensing notes and NetPFN alternative documentation
- Update THIRD_PARTY_LICENSES.txt with TabPFN commercial license entry
</commit_message>
<xml_diff>
--- a/FraudTrap_Complete_Study_Guide.docx
+++ b/FraudTrap_Complete_Study_Guide.docx
@@ -288,7 +288,7 @@
         <w:ind w:left="0"/>
       </w:pPr>
       <w:r>
-        <w:t>Three-Phase ML Lifecycle — Cold Start (unsupervised) → Semi-Supervised → Supervised, eliminating the cold-start problem</w:t>
+        <w:t>Three-Phase ML Lifecycle — Cold Start (unsupervised) → Adaptive Learning → Supervised, eliminating the cold-start problem</w:t>
       </w:r>
     </w:p>
     <w:p>
@@ -2806,7 +2806,7 @@
               <w:rPr>
                 <w:sz w:val="20"/>
               </w:rPr>
-              <w:t>UNSUPERVISED, SEMI_SUPERVISED, SUPERVISED, or RULES</w:t>
+              <w:t>UNSUPERVISED, ADAPTIVE_LEARNING, SUPERVISED, or RULES</w:t>
             </w:r>
           </w:p>
         </w:tc>
@@ -3703,7 +3703,7 @@
         <w:pStyle w:val="Heading3"/>
       </w:pPr>
       <w:r>
-        <w:t>Phase 2: Semi-Supervised</w:t>
+        <w:t>Phase 2: Adaptive Learning</w:t>
       </w:r>
     </w:p>
     <w:p>
@@ -3717,7 +3717,7 @@
         <w:ind w:left="0"/>
       </w:pPr>
       <w:r>
-        <w:t>NetPFN (Neural Prototypical Few-shot Network) replaces XGBoost bridge</w:t>
+        <w:t>TabPFN (Tabular Prior-data Fitted Network) replaces XGBoost bridge TabPFN requires a commercial license key from Prior Labs (priorlabs.ai), set via the TABPFN_TOKEN environment variable. For organizations that cannot use TabPFN, FraudTrap supports NetPFN as a fully permissive alternative — set learner: netpfn in config/supervised.yaml.</w:t>
       </w:r>
     </w:p>
     <w:p>
@@ -4715,12 +4715,12 @@
         <w:pStyle w:val="Heading2"/>
       </w:pPr>
       <w:r>
-        <w:t>6.2 Semi-Supervised: Ensemble Methods</w:t>
-      </w:r>
-    </w:p>
-    <w:p>
-      <w:r>
-        <w:t>Implemented in models/supervised/semi_supervised.py. The NetPFN (Neural Prototypical Few-shot Network) uses prototype-based few-shot learning with pseudo-labelsised model from unsupervised scores:</w:t>
+        <w:t>6.2 Adaptive Learning: TabPFN Foundation Model TabPFN requires a commercial license key from Prior Labs (priorlabs.ai), set via the TABPFN_TOKEN environment variable. For organizations that cannot use TabPFN, FraudTrap supports NetPFN as a fully permissive alternative — set learner: netpfn in config/supervised.yaml.</w:t>
+      </w:r>
+    </w:p>
+    <w:p>
+      <w:r>
+        <w:t>Implemented in models/adaptive_learning/tabpfn_learner.py. The TabPFN (Tabular Prior-data Fitted Network) uses in-context learning with pseudo-labels to expand the training set, creating an adaptive learning model from unsupervised scores:</w:t>
       </w:r>
     </w:p>
     <w:p>
@@ -4738,7 +4738,7 @@
         <w:ind w:left="0"/>
       </w:pPr>
       <w:r>
-        <w:t>Prototype learning: Fraud/legitimate prototypes in embedding space</w:t>
+        <w:t>In-context learning: Stores labeled examples in transformer context</w:t>
       </w:r>
     </w:p>
     <w:p>
@@ -4756,7 +4756,7 @@
         <w:ind w:left="0"/>
       </w:pPr>
       <w:r>
-        <w:t>Distance-based classification: New transactions classified by prototype proximity</w:t>
+        <w:t>Transformer attention: New transactions classified via attention over context examples</w:t>
       </w:r>
     </w:p>
     <w:p>

</xml_diff>